<commit_message>
Fix Form 346 signing name: center-align without tabs/indent
Name was splitting across 2 lines due to 4 tabs + firstLine indent
pushing it too far right. Changed to center-aligned with no leading
whitespace so any length name fits on one line.

Co-Authored-By: Claude Opus 4.6 <noreply@anthropic.com>
</commit_message>
<xml_diff>
--- a/probate_templates/form346_personal_rep.docx
+++ b/probate_templates/form346_personal_rep.docx
@@ -1348,23 +1348,20 @@
     <w:p>
       <w:pPr>
         <w:pStyle w:val="Normal"/>
-        <w:ind w:firstLine="720" w:start="2880" w:end="0"/>
-        <w:rPr>
-          <w:rFonts w:eastAsia="SimHei;黑体"/>
-          <w:spacing w:val="8"/>
-          <w:lang w:eastAsia="zh-CN"/>
-        </w:rPr>
-      </w:pPr>
-      <w:r>
-        <w:rPr>
-          <w:rFonts w:eastAsia="SimHei;黑体"/>
-          <w:spacing w:val="8"/>
-          <w:lang w:eastAsia="zh-CN"/>
-        </w:rPr>
-        <w:tab/>
-        <w:tab/>
-        <w:tab/>
-        <w:tab/>
+        <w:ind w:start="2880" w:end="0"/>
+        <w:rPr>
+          <w:rFonts w:eastAsia="SimHei;黑体"/>
+          <w:spacing w:val="8"/>
+          <w:lang w:eastAsia="zh-CN"/>
+        </w:rPr>
+        <w:jc w:val="center"/>
+      </w:pPr>
+      <w:r>
+        <w:rPr>
+          <w:rFonts w:eastAsia="SimHei;黑体"/>
+          <w:spacing w:val="8"/>
+          <w:lang w:eastAsia="zh-CN"/>
+        </w:rPr>
         <w:t>{{APPLICANT_NAME}}</w:t>
       </w:r>
       <w:bookmarkStart w:id="1" w:name="_Hlk120106340"/>

</xml_diff>